<commit_message>
Fix filter options not populating - compute from tags if not initialized
- Fixed updateFilterOptions() to compute filter options from tags if originalFilterOptions not set
- Ensures filter dropdowns populate with all available options instead of just showing 'ALL'
- Store originalFilterOptions when tags are loaded to prevent early return in updateFilterOptions()
</commit_message>
<xml_diff>
--- a/src/core/generation/templates/preroll.docx
+++ b/src/core/generation/templates/preroll.docx
@@ -50,7 +50,7 @@
             </w:tblGrid>
             <w:tr>
               <w:trPr>
-                <w:trHeight w:val="1258"/>
+                <w:trHeight w:val="972"/>
               </w:trPr>
               <w:tc>
                 <w:tcPr>
@@ -117,7 +117,49 @@
           <w:tbl>
             <w:tblPr>
               <w:tblStyle w:val="TableGrid"/>
-              <w:tblpPr w:leftFromText="187" w:rightFromText="187" w:vertAnchor="page" w:horzAnchor="margin" w:tblpY="2094"/>
+              <w:tblW w:w="0" w:type="auto"/>
+              <w:jc w:val="center"/>
+              <w:tblLook w:val="04A0" w:firstRow="1" w:lastRow="0" w:firstColumn="1" w:lastColumn="0" w:noHBand="0" w:noVBand="1"/>
+            </w:tblPr>
+            <w:tblGrid>
+              <w:gridCol w:w="2120"/>
+            </w:tblGrid>
+            <w:tr>
+              <w:trPr>
+                <w:jc w:val="center"/>
+              </w:trPr>
+              <w:tc>
+                <w:tcPr>
+                  <w:tcW w:w="2120" w:type="dxa"/>
+                  <w:vAlign w:val="center"/>
+                </w:tcPr>
+                <w:p>
+                  <w:pPr>
+                    <w:framePr w:wrap="around" w:hAnchor="margin" w:xAlign="center" w:y="303"/>
+                    <w:suppressOverlap/>
+                    <w:rPr>
+                      <w:sz w:val="2"/>
+                      <w:szCs w:val="2"/>
+                    </w:rPr>
+                  </w:pPr>
+                  <w:r>
+                    <w:rPr>
+                      <w:rFonts w:ascii="Arial" w:hAnsi="Arial" w:cs="Arial"/>
+                      <w:b/>
+                      <w:bCs/>
+                      <w:sz w:val="16"/>
+                      <w:szCs w:val="16"/>
+                    </w:rPr>
+                    <w:t>{{Label1.ProductBrand}}</w:t>
+                  </w:r>
+                </w:p>
+              </w:tc>
+            </w:tr>
+          </w:tbl>
+          <w:tbl>
+            <w:tblPr>
+              <w:tblStyle w:val="TableGrid"/>
+              <w:tblpPr w:leftFromText="187" w:rightFromText="187" w:vertAnchor="page" w:horzAnchor="margin" w:tblpY="1309"/>
               <w:tblOverlap w:val="never"/>
               <w:tblW w:w="2160" w:type="dxa"/>
               <w:tblBorders>
@@ -132,17 +174,16 @@
               <w:tblLook w:val="04A0" w:firstRow="1" w:lastRow="0" w:firstColumn="1" w:lastColumn="0" w:noHBand="0" w:noVBand="1"/>
             </w:tblPr>
             <w:tblGrid>
-              <w:gridCol w:w="900"/>
-              <w:gridCol w:w="504"/>
-              <w:gridCol w:w="756"/>
+              <w:gridCol w:w="990"/>
+              <w:gridCol w:w="1170"/>
             </w:tblGrid>
             <w:tr>
               <w:trPr>
-                <w:trHeight w:hRule="exact" w:val="576"/>
+                <w:trHeight w:hRule="exact" w:val="811"/>
               </w:trPr>
               <w:tc>
                 <w:tcPr>
-                  <w:tcW w:w="900" w:type="dxa"/>
+                  <w:tcW w:w="990" w:type="dxa"/>
                   <w:shd w:val="clear" w:color="auto" w:fill="CCCCCC"/>
                   <w:vAlign w:val="center"/>
                 </w:tcPr>
@@ -168,35 +209,7 @@
               </w:tc>
               <w:tc>
                 <w:tcPr>
-                  <w:tcW w:w="504" w:type="dxa"/>
-                  <w:shd w:val="clear" w:color="auto" w:fill="CCCCCC"/>
-                  <w:tcMar>
-                    <w:left w:w="29" w:type="dxa"/>
-                    <w:right w:w="29" w:type="dxa"/>
-                  </w:tcMar>
-                  <w:vAlign w:val="center"/>
-                </w:tcPr>
-                <w:p>
-                  <w:pPr>
-                    <w:rPr>
-                      <w:sz w:val="13"/>
-                      <w:szCs w:val="13"/>
-                    </w:rPr>
-                  </w:pPr>
-                  <w:r>
-                    <w:rPr>
-                      <w:b/>
-                      <w:bCs/>
-                      <w:sz w:val="13"/>
-                      <w:szCs w:val="13"/>
-                    </w:rPr>
-                    <w:t>{{Label1.DOH }}</w:t>
-                  </w:r>
-                </w:p>
-              </w:tc>
-              <w:tc>
-                <w:tcPr>
-                  <w:tcW w:w="756" w:type="dxa"/>
+                  <w:tcW w:w="1170" w:type="dxa"/>
                   <w:shd w:val="clear" w:color="auto" w:fill="CCCCCC"/>
                   <w:tcMar>
                     <w:left w:w="29" w:type="dxa"/>
@@ -240,48 +253,6 @@
                       <w:szCs w:val="13"/>
                     </w:rPr>
                     <w:t>}}</w:t>
-                  </w:r>
-                </w:p>
-              </w:tc>
-            </w:tr>
-          </w:tbl>
-          <w:tbl>
-            <w:tblPr>
-              <w:tblStyle w:val="TableGrid"/>
-              <w:tblW w:w="0" w:type="auto"/>
-              <w:jc w:val="center"/>
-              <w:tblLook w:val="04A0" w:firstRow="1" w:lastRow="0" w:firstColumn="1" w:lastColumn="0" w:noHBand="0" w:noVBand="1"/>
-            </w:tblPr>
-            <w:tblGrid>
-              <w:gridCol w:w="2120"/>
-            </w:tblGrid>
-            <w:tr>
-              <w:trPr>
-                <w:jc w:val="center"/>
-              </w:trPr>
-              <w:tc>
-                <w:tcPr>
-                  <w:tcW w:w="2120" w:type="dxa"/>
-                  <w:vAlign w:val="center"/>
-                </w:tcPr>
-                <w:p>
-                  <w:pPr>
-                    <w:framePr w:wrap="around" w:hAnchor="margin" w:xAlign="center" w:y="303"/>
-                    <w:suppressOverlap/>
-                    <w:rPr>
-                      <w:sz w:val="2"/>
-                      <w:szCs w:val="2"/>
-                    </w:rPr>
-                  </w:pPr>
-                  <w:r>
-                    <w:rPr>
-                      <w:rFonts w:ascii="Arial" w:hAnsi="Arial" w:cs="Arial"/>
-                      <w:b/>
-                      <w:bCs/>
-                      <w:sz w:val="16"/>
-                      <w:szCs w:val="16"/>
-                    </w:rPr>
-                    <w:t>{{Label1.ProductBrand}}</w:t>
                   </w:r>
                 </w:p>
               </w:tc>

</xml_diff>

<commit_message>
Update font sizing and other core improvements
</commit_message>
<xml_diff>
--- a/src/core/generation/templates/preroll.docx
+++ b/src/core/generation/templates/preroll.docx
@@ -50,7 +50,7 @@
             </w:tblGrid>
             <w:tr>
               <w:trPr>
-                <w:trHeight w:val="972"/>
+                <w:trHeight w:val="1062"/>
               </w:trPr>
               <w:tc>
                 <w:tcPr>
@@ -126,6 +126,7 @@
             </w:tblGrid>
             <w:tr>
               <w:trPr>
+                <w:trHeight w:val="191"/>
                 <w:jc w:val="center"/>
               </w:trPr>
               <w:tc>
@@ -159,7 +160,7 @@
           <w:tbl>
             <w:tblPr>
               <w:tblStyle w:val="TableGrid"/>
-              <w:tblpPr w:leftFromText="187" w:rightFromText="187" w:vertAnchor="page" w:horzAnchor="margin" w:tblpY="1309"/>
+              <w:tblpPr w:leftFromText="187" w:rightFromText="187" w:vertAnchor="page" w:horzAnchor="margin" w:tblpY="1408"/>
               <w:tblOverlap w:val="never"/>
               <w:tblW w:w="2160" w:type="dxa"/>
               <w:tblBorders>
@@ -174,16 +175,16 @@
               <w:tblLook w:val="04A0" w:firstRow="1" w:lastRow="0" w:firstColumn="1" w:lastColumn="0" w:noHBand="0" w:noVBand="1"/>
             </w:tblPr>
             <w:tblGrid>
-              <w:gridCol w:w="990"/>
-              <w:gridCol w:w="1170"/>
+              <w:gridCol w:w="1080"/>
+              <w:gridCol w:w="1080"/>
             </w:tblGrid>
             <w:tr>
               <w:trPr>
-                <w:trHeight w:hRule="exact" w:val="811"/>
+                <w:trHeight w:val="632"/>
               </w:trPr>
               <w:tc>
                 <w:tcPr>
-                  <w:tcW w:w="990" w:type="dxa"/>
+                  <w:tcW w:w="1080" w:type="dxa"/>
                   <w:shd w:val="clear" w:color="auto" w:fill="CCCCCC"/>
                   <w:vAlign w:val="center"/>
                 </w:tcPr>
@@ -209,7 +210,7 @@
               </w:tc>
               <w:tc>
                 <w:tcPr>
-                  <w:tcW w:w="1170" w:type="dxa"/>
+                  <w:tcW w:w="1080" w:type="dxa"/>
                   <w:shd w:val="clear" w:color="auto" w:fill="CCCCCC"/>
                   <w:tcMar>
                     <w:left w:w="29" w:type="dxa"/>
@@ -219,6 +220,7 @@
                 </w:tcPr>
                 <w:p>
                   <w:pPr>
+                    <w:jc w:val="center"/>
                     <w:rPr>
                       <w:sz w:val="13"/>
                       <w:szCs w:val="13"/>

</xml_diff>

<commit_message>
Update core generation files and templates
</commit_message>
<xml_diff>
--- a/src/core/generation/templates/preroll.docx
+++ b/src/core/generation/templates/preroll.docx
@@ -25,14 +25,13 @@
       <w:tr>
         <w:trPr>
           <w:cantSplit/>
-          <w:trHeight w:hRule="exact" w:val="2160"/>
+          <w:trHeight w:hRule="exact" w:val="2713"/>
         </w:trPr>
         <w:tc>
           <w:tcPr>
             <w:tcW w:w="2160" w:type="dxa"/>
             <w:shd w:val="clear" w:color="auto" w:fill="13274B"/>
             <w:noWrap/>
-            <w:vAlign w:val="center"/>
           </w:tcPr>
           <w:tbl>
             <w:tblPr>
@@ -50,7 +49,7 @@
             </w:tblGrid>
             <w:tr>
               <w:trPr>
-                <w:trHeight w:val="1062"/>
+                <w:trHeight w:val="1242"/>
               </w:trPr>
               <w:tc>
                 <w:tcPr>
@@ -114,53 +113,32 @@
               </w:tc>
             </w:tr>
           </w:tbl>
+          <w:p>
+            <w:pPr>
+              <w:spacing w:after="160" w:line="278" w:lineRule="auto"/>
+              <w:rPr>
+                <w:rFonts w:ascii="Arial" w:hAnsi="Arial" w:cs="Arial"/>
+                <w:b/>
+                <w:bCs/>
+                <w:sz w:val="16"/>
+                <w:szCs w:val="16"/>
+              </w:rPr>
+            </w:pPr>
+            <w:r>
+              <w:rPr>
+                <w:rFonts w:ascii="Arial" w:hAnsi="Arial" w:cs="Arial"/>
+                <w:b/>
+                <w:bCs/>
+                <w:sz w:val="16"/>
+                <w:szCs w:val="16"/>
+              </w:rPr>
+              <w:t>{{Label1.ProductBrand}}</w:t>
+            </w:r>
+          </w:p>
           <w:tbl>
             <w:tblPr>
               <w:tblStyle w:val="TableGrid"/>
-              <w:tblW w:w="0" w:type="auto"/>
-              <w:jc w:val="center"/>
-              <w:tblLook w:val="04A0" w:firstRow="1" w:lastRow="0" w:firstColumn="1" w:lastColumn="0" w:noHBand="0" w:noVBand="1"/>
-            </w:tblPr>
-            <w:tblGrid>
-              <w:gridCol w:w="2120"/>
-            </w:tblGrid>
-            <w:tr>
-              <w:trPr>
-                <w:trHeight w:hRule="exact" w:val="328"/>
-                <w:jc w:val="center"/>
-              </w:trPr>
-              <w:tc>
-                <w:tcPr>
-                  <w:tcW w:w="2120" w:type="dxa"/>
-                  <w:vAlign w:val="center"/>
-                </w:tcPr>
-                <w:p>
-                  <w:pPr>
-                    <w:framePr w:wrap="around" w:hAnchor="margin" w:xAlign="center" w:y="303"/>
-                    <w:suppressOverlap/>
-                    <w:rPr>
-                      <w:sz w:val="2"/>
-                      <w:szCs w:val="2"/>
-                    </w:rPr>
-                  </w:pPr>
-                  <w:r>
-                    <w:rPr>
-                      <w:rFonts w:ascii="Arial" w:hAnsi="Arial" w:cs="Arial"/>
-                      <w:b/>
-                      <w:bCs/>
-                      <w:sz w:val="16"/>
-                      <w:szCs w:val="16"/>
-                    </w:rPr>
-                    <w:t>{{Label1.ProductBrand}}</w:t>
-                  </w:r>
-                </w:p>
-              </w:tc>
-            </w:tr>
-          </w:tbl>
-          <w:tbl>
-            <w:tblPr>
-              <w:tblStyle w:val="TableGrid"/>
-              <w:tblpPr w:leftFromText="187" w:rightFromText="187" w:vertAnchor="page" w:horzAnchor="margin" w:tblpY="1458"/>
+              <w:tblpPr w:leftFromText="187" w:rightFromText="187" w:vertAnchor="page" w:horzAnchor="margin" w:tblpY="1574"/>
               <w:tblOverlap w:val="never"/>
               <w:tblW w:w="2160" w:type="dxa"/>
               <w:tblBorders>
@@ -180,11 +158,14 @@
             </w:tblGrid>
             <w:tr>
               <w:trPr>
-                <w:trHeight w:hRule="exact" w:val="634"/>
+                <w:trHeight w:hRule="exact" w:val="873"/>
               </w:trPr>
               <w:tc>
                 <w:tcPr>
                   <w:tcW w:w="1080" w:type="dxa"/>
+                  <w:tcBorders>
+                    <w:bottom w:val="single" w:sz="4" w:space="0" w:color="auto"/>
+                  </w:tcBorders>
                   <w:shd w:val="clear" w:color="auto" w:fill="CCCCCC"/>
                   <w:vAlign w:val="center"/>
                 </w:tcPr>
@@ -211,6 +192,9 @@
               <w:tc>
                 <w:tcPr>
                   <w:tcW w:w="1080" w:type="dxa"/>
+                  <w:tcBorders>
+                    <w:bottom w:val="single" w:sz="4" w:space="0" w:color="auto"/>
+                  </w:tcBorders>
                   <w:shd w:val="clear" w:color="auto" w:fill="CCCCCC"/>
                   <w:tcMar>
                     <w:left w:w="29" w:type="dxa"/>
@@ -256,10 +240,82 @@
                     </w:rPr>
                     <w:t>}}</w:t>
                   </w:r>
+                  <w:r>
+                    <w:rPr>
+                      <w:rFonts w:ascii="Arial" w:hAnsi="Arial" w:cs="Arial"/>
+                      <w:b/>
+                      <w:bCs/>
+                      <w:sz w:val="13"/>
+                      <w:szCs w:val="13"/>
+                    </w:rPr>
+                    <w:t>/</w:t>
+                  </w:r>
+                </w:p>
+              </w:tc>
+            </w:tr>
+            <w:tr>
+              <w:trPr>
+                <w:trHeight w:hRule="exact" w:val="215"/>
+              </w:trPr>
+              <w:tc>
+                <w:tcPr>
+                  <w:tcW w:w="1080" w:type="dxa"/>
+                  <w:tcBorders>
+                    <w:top w:val="single" w:sz="4" w:space="0" w:color="auto"/>
+                  </w:tcBorders>
+                  <w:shd w:val="clear" w:color="auto" w:fill="FFFFFF" w:themeFill="background1"/>
+                  <w:vAlign w:val="center"/>
+                </w:tcPr>
+                <w:p>
+                  <w:pPr>
+                    <w:rPr>
+                      <w:rFonts w:ascii="Arial" w:hAnsi="Arial" w:cs="Arial"/>
+                      <w:b/>
+                      <w:bCs/>
+                      <w:color w:val="000000" w:themeColor="text1"/>
+                      <w:sz w:val="13"/>
+                      <w:szCs w:val="13"/>
+                    </w:rPr>
+                  </w:pPr>
+                </w:p>
+              </w:tc>
+              <w:tc>
+                <w:tcPr>
+                  <w:tcW w:w="1080" w:type="dxa"/>
+                  <w:tcBorders>
+                    <w:top w:val="single" w:sz="4" w:space="0" w:color="auto"/>
+                  </w:tcBorders>
+                  <w:shd w:val="clear" w:color="auto" w:fill="FFFFFF" w:themeFill="background1"/>
+                  <w:tcMar>
+                    <w:left w:w="29" w:type="dxa"/>
+                    <w:right w:w="29" w:type="dxa"/>
+                  </w:tcMar>
+                  <w:vAlign w:val="center"/>
+                </w:tcPr>
+                <w:p>
+                  <w:pPr>
+                    <w:jc w:val="center"/>
+                    <w:rPr>
+                      <w:rFonts w:ascii="Arial" w:hAnsi="Arial" w:cs="Arial"/>
+                      <w:b/>
+                      <w:bCs/>
+                      <w:sz w:val="13"/>
+                      <w:szCs w:val="13"/>
+                    </w:rPr>
+                  </w:pPr>
                 </w:p>
               </w:tc>
             </w:tr>
           </w:tbl>
+          <w:p>
+            <w:pPr>
+              <w:spacing w:after="160" w:line="278" w:lineRule="auto"/>
+              <w:rPr>
+                <w:sz w:val="2"/>
+                <w:szCs w:val="2"/>
+              </w:rPr>
+            </w:pPr>
+          </w:p>
           <w:p>
             <w:pPr>
               <w:rPr>

</xml_diff>

<commit_message>
Update constants, template_processor, and preroll template
</commit_message>
<xml_diff>
--- a/src/core/generation/templates/preroll.docx
+++ b/src/core/generation/templates/preroll.docx
@@ -25,13 +25,14 @@
       <w:tr>
         <w:trPr>
           <w:cantSplit/>
-          <w:trHeight w:hRule="exact" w:val="2713"/>
+          <w:trHeight w:hRule="exact" w:val="2160"/>
         </w:trPr>
         <w:tc>
           <w:tcPr>
             <w:tcW w:w="2160" w:type="dxa"/>
             <w:shd w:val="clear" w:color="auto" w:fill="13274B"/>
             <w:noWrap/>
+            <w:vAlign w:val="center"/>
           </w:tcPr>
           <w:tbl>
             <w:tblPr>
@@ -49,7 +50,7 @@
             </w:tblGrid>
             <w:tr>
               <w:trPr>
-                <w:trHeight w:val="1242"/>
+                <w:trHeight w:val="1062"/>
               </w:trPr>
               <w:tc>
                 <w:tcPr>
@@ -113,32 +114,53 @@
               </w:tc>
             </w:tr>
           </w:tbl>
-          <w:p>
-            <w:pPr>
-              <w:spacing w:after="160" w:line="278" w:lineRule="auto"/>
-              <w:rPr>
-                <w:rFonts w:ascii="Arial" w:hAnsi="Arial" w:cs="Arial"/>
-                <w:b/>
-                <w:bCs/>
-                <w:sz w:val="16"/>
-                <w:szCs w:val="16"/>
-              </w:rPr>
-            </w:pPr>
-            <w:r>
-              <w:rPr>
-                <w:rFonts w:ascii="Arial" w:hAnsi="Arial" w:cs="Arial"/>
-                <w:b/>
-                <w:bCs/>
-                <w:sz w:val="16"/>
-                <w:szCs w:val="16"/>
-              </w:rPr>
-              <w:t>{{Label1.ProductBrand}}</w:t>
-            </w:r>
-          </w:p>
           <w:tbl>
             <w:tblPr>
               <w:tblStyle w:val="TableGrid"/>
-              <w:tblpPr w:leftFromText="187" w:rightFromText="187" w:vertAnchor="page" w:horzAnchor="margin" w:tblpY="1574"/>
+              <w:tblW w:w="0" w:type="auto"/>
+              <w:jc w:val="center"/>
+              <w:tblLook w:val="04A0" w:firstRow="1" w:lastRow="0" w:firstColumn="1" w:lastColumn="0" w:noHBand="0" w:noVBand="1"/>
+            </w:tblPr>
+            <w:tblGrid>
+              <w:gridCol w:w="2120"/>
+            </w:tblGrid>
+            <w:tr>
+              <w:trPr>
+                <w:trHeight w:hRule="exact" w:val="328"/>
+                <w:jc w:val="center"/>
+              </w:trPr>
+              <w:tc>
+                <w:tcPr>
+                  <w:tcW w:w="2120" w:type="dxa"/>
+                  <w:vAlign w:val="center"/>
+                </w:tcPr>
+                <w:p>
+                  <w:pPr>
+                    <w:framePr w:wrap="around" w:hAnchor="margin" w:xAlign="center" w:y="303"/>
+                    <w:suppressOverlap/>
+                    <w:rPr>
+                      <w:sz w:val="2"/>
+                      <w:szCs w:val="2"/>
+                    </w:rPr>
+                  </w:pPr>
+                  <w:r>
+                    <w:rPr>
+                      <w:rFonts w:ascii="Arial" w:hAnsi="Arial" w:cs="Arial"/>
+                      <w:b/>
+                      <w:bCs/>
+                      <w:sz w:val="16"/>
+                      <w:szCs w:val="16"/>
+                    </w:rPr>
+                    <w:t>{{Label1.ProductBrand}}</w:t>
+                  </w:r>
+                </w:p>
+              </w:tc>
+            </w:tr>
+          </w:tbl>
+          <w:tbl>
+            <w:tblPr>
+              <w:tblStyle w:val="TableGrid"/>
+              <w:tblpPr w:leftFromText="187" w:rightFromText="187" w:vertAnchor="page" w:horzAnchor="margin" w:tblpY="1458"/>
               <w:tblOverlap w:val="never"/>
               <w:tblW w:w="2160" w:type="dxa"/>
               <w:tblBorders>
@@ -158,14 +180,11 @@
             </w:tblGrid>
             <w:tr>
               <w:trPr>
-                <w:trHeight w:hRule="exact" w:val="873"/>
+                <w:trHeight w:hRule="exact" w:val="634"/>
               </w:trPr>
               <w:tc>
                 <w:tcPr>
                   <w:tcW w:w="1080" w:type="dxa"/>
-                  <w:tcBorders>
-                    <w:bottom w:val="single" w:sz="4" w:space="0" w:color="auto"/>
-                  </w:tcBorders>
                   <w:shd w:val="clear" w:color="auto" w:fill="CCCCCC"/>
                   <w:vAlign w:val="center"/>
                 </w:tcPr>
@@ -192,9 +211,6 @@
               <w:tc>
                 <w:tcPr>
                   <w:tcW w:w="1080" w:type="dxa"/>
-                  <w:tcBorders>
-                    <w:bottom w:val="single" w:sz="4" w:space="0" w:color="auto"/>
-                  </w:tcBorders>
                   <w:shd w:val="clear" w:color="auto" w:fill="CCCCCC"/>
                   <w:tcMar>
                     <w:left w:w="29" w:type="dxa"/>
@@ -240,82 +256,10 @@
                     </w:rPr>
                     <w:t>}}</w:t>
                   </w:r>
-                  <w:r>
-                    <w:rPr>
-                      <w:rFonts w:ascii="Arial" w:hAnsi="Arial" w:cs="Arial"/>
-                      <w:b/>
-                      <w:bCs/>
-                      <w:sz w:val="13"/>
-                      <w:szCs w:val="13"/>
-                    </w:rPr>
-                    <w:t>/</w:t>
-                  </w:r>
-                </w:p>
-              </w:tc>
-            </w:tr>
-            <w:tr>
-              <w:trPr>
-                <w:trHeight w:hRule="exact" w:val="215"/>
-              </w:trPr>
-              <w:tc>
-                <w:tcPr>
-                  <w:tcW w:w="1080" w:type="dxa"/>
-                  <w:tcBorders>
-                    <w:top w:val="single" w:sz="4" w:space="0" w:color="auto"/>
-                  </w:tcBorders>
-                  <w:shd w:val="clear" w:color="auto" w:fill="FFFFFF" w:themeFill="background1"/>
-                  <w:vAlign w:val="center"/>
-                </w:tcPr>
-                <w:p>
-                  <w:pPr>
-                    <w:rPr>
-                      <w:rFonts w:ascii="Arial" w:hAnsi="Arial" w:cs="Arial"/>
-                      <w:b/>
-                      <w:bCs/>
-                      <w:color w:val="000000" w:themeColor="text1"/>
-                      <w:sz w:val="13"/>
-                      <w:szCs w:val="13"/>
-                    </w:rPr>
-                  </w:pPr>
-                </w:p>
-              </w:tc>
-              <w:tc>
-                <w:tcPr>
-                  <w:tcW w:w="1080" w:type="dxa"/>
-                  <w:tcBorders>
-                    <w:top w:val="single" w:sz="4" w:space="0" w:color="auto"/>
-                  </w:tcBorders>
-                  <w:shd w:val="clear" w:color="auto" w:fill="FFFFFF" w:themeFill="background1"/>
-                  <w:tcMar>
-                    <w:left w:w="29" w:type="dxa"/>
-                    <w:right w:w="29" w:type="dxa"/>
-                  </w:tcMar>
-                  <w:vAlign w:val="center"/>
-                </w:tcPr>
-                <w:p>
-                  <w:pPr>
-                    <w:jc w:val="center"/>
-                    <w:rPr>
-                      <w:rFonts w:ascii="Arial" w:hAnsi="Arial" w:cs="Arial"/>
-                      <w:b/>
-                      <w:bCs/>
-                      <w:sz w:val="13"/>
-                      <w:szCs w:val="13"/>
-                    </w:rPr>
-                  </w:pPr>
                 </w:p>
               </w:tc>
             </w:tr>
           </w:tbl>
-          <w:p>
-            <w:pPr>
-              <w:spacing w:after="160" w:line="278" w:lineRule="auto"/>
-              <w:rPr>
-                <w:sz w:val="2"/>
-                <w:szCs w:val="2"/>
-              </w:rPr>
-            </w:pPr>
-          </w:p>
           <w:p>
             <w:pPr>
               <w:rPr>

</xml_diff>

<commit_message>
Update template processor, styles, and JavaScript files
</commit_message>
<xml_diff>
--- a/src/core/generation/templates/preroll.docx
+++ b/src/core/generation/templates/preroll.docx
@@ -50,7 +50,7 @@
             </w:tblGrid>
             <w:tr>
               <w:trPr>
-                <w:trHeight w:val="1062"/>
+                <w:trHeight w:val="999"/>
               </w:trPr>
               <w:tc>
                 <w:tcPr>
@@ -126,7 +126,7 @@
             </w:tblGrid>
             <w:tr>
               <w:trPr>
-                <w:trHeight w:hRule="exact" w:val="328"/>
+                <w:trHeight w:val="223"/>
                 <w:jc w:val="center"/>
               </w:trPr>
               <w:tc>
@@ -160,7 +160,7 @@
           <w:tbl>
             <w:tblPr>
               <w:tblStyle w:val="TableGrid"/>
-              <w:tblpPr w:leftFromText="187" w:rightFromText="187" w:vertAnchor="page" w:horzAnchor="margin" w:tblpY="1458"/>
+              <w:tblpPr w:leftFromText="187" w:rightFromText="187" w:vertAnchor="page" w:horzAnchor="margin" w:tblpY="1379"/>
               <w:tblOverlap w:val="never"/>
               <w:tblW w:w="2160" w:type="dxa"/>
               <w:tblBorders>
@@ -175,16 +175,17 @@
               <w:tblLook w:val="04A0" w:firstRow="1" w:lastRow="0" w:firstColumn="1" w:lastColumn="0" w:noHBand="0" w:noVBand="1"/>
             </w:tblPr>
             <w:tblGrid>
-              <w:gridCol w:w="1080"/>
-              <w:gridCol w:w="1080"/>
+              <w:gridCol w:w="900"/>
+              <w:gridCol w:w="504"/>
+              <w:gridCol w:w="756"/>
             </w:tblGrid>
             <w:tr>
               <w:trPr>
-                <w:trHeight w:hRule="exact" w:val="634"/>
+                <w:trHeight w:hRule="exact" w:val="724"/>
               </w:trPr>
               <w:tc>
                 <w:tcPr>
-                  <w:tcW w:w="1080" w:type="dxa"/>
+                  <w:tcW w:w="900" w:type="dxa"/>
                   <w:shd w:val="clear" w:color="auto" w:fill="CCCCCC"/>
                   <w:vAlign w:val="center"/>
                 </w:tcPr>
@@ -210,7 +211,7 @@
               </w:tc>
               <w:tc>
                 <w:tcPr>
-                  <w:tcW w:w="1080" w:type="dxa"/>
+                  <w:tcW w:w="504" w:type="dxa"/>
                   <w:shd w:val="clear" w:color="auto" w:fill="CCCCCC"/>
                   <w:tcMar>
                     <w:left w:w="29" w:type="dxa"/>
@@ -220,7 +221,34 @@
                 </w:tcPr>
                 <w:p>
                   <w:pPr>
-                    <w:jc w:val="center"/>
+                    <w:rPr>
+                      <w:sz w:val="13"/>
+                      <w:szCs w:val="13"/>
+                    </w:rPr>
+                  </w:pPr>
+                  <w:r>
+                    <w:rPr>
+                      <w:b/>
+                      <w:bCs/>
+                      <w:sz w:val="13"/>
+                      <w:szCs w:val="13"/>
+                    </w:rPr>
+                    <w:t>{{Label1.DOH }}</w:t>
+                  </w:r>
+                </w:p>
+              </w:tc>
+              <w:tc>
+                <w:tcPr>
+                  <w:tcW w:w="756" w:type="dxa"/>
+                  <w:shd w:val="clear" w:color="auto" w:fill="CCCCCC"/>
+                  <w:tcMar>
+                    <w:left w:w="29" w:type="dxa"/>
+                    <w:right w:w="29" w:type="dxa"/>
+                  </w:tcMar>
+                  <w:vAlign w:val="center"/>
+                </w:tcPr>
+                <w:p>
+                  <w:pPr>
                     <w:rPr>
                       <w:sz w:val="13"/>
                       <w:szCs w:val="13"/>

</xml_diff>

<commit_message>
Eliminate filter loading delays completely
- Remove all retry mechanisms (maxRetries: 1->0, no setTimeout delays)
- Remove refresh=true parameter from API call to use cached data
- Skip API call entirely when filters populated from cache
- Makes filter display truly instant with zero delays
</commit_message>
<xml_diff>
--- a/src/core/generation/templates/preroll.docx
+++ b/src/core/generation/templates/preroll.docx
@@ -175,9 +175,9 @@
               <w:tblLook w:val="04A0" w:firstRow="1" w:lastRow="0" w:firstColumn="1" w:lastColumn="0" w:noHBand="0" w:noVBand="1"/>
             </w:tblPr>
             <w:tblGrid>
-              <w:gridCol w:w="900"/>
-              <w:gridCol w:w="504"/>
-              <w:gridCol w:w="756"/>
+              <w:gridCol w:w="852"/>
+              <w:gridCol w:w="523"/>
+              <w:gridCol w:w="785"/>
             </w:tblGrid>
             <w:tr>
               <w:trPr>
@@ -185,7 +185,7 @@
               </w:trPr>
               <w:tc>
                 <w:tcPr>
-                  <w:tcW w:w="900" w:type="dxa"/>
+                  <w:tcW w:w="821" w:type="dxa"/>
                   <w:shd w:val="clear" w:color="auto" w:fill="CCCCCC"/>
                   <w:vAlign w:val="center"/>
                 </w:tcPr>

</xml_diff>

<commit_message>
Make QR code smaller for preroll template
- Reduce QR code size from 24pt to 18pt for preroll template
- Makes QR codes more compact while still scannable
</commit_message>
<xml_diff>
--- a/src/core/generation/templates/preroll.docx
+++ b/src/core/generation/templates/preroll.docx
@@ -132,6 +132,12 @@
               <w:tc>
                 <w:tcPr>
                   <w:tcW w:w="2120" w:type="dxa"/>
+                  <w:tcBorders>
+                    <w:top w:val="nil"/>
+                    <w:left w:val="nil"/>
+                    <w:bottom w:val="nil"/>
+                    <w:right w:val="nil"/>
+                  </w:tcBorders>
                   <w:vAlign w:val="center"/>
                 </w:tcPr>
                 <w:p>
@@ -175,9 +181,9 @@
               <w:tblLook w:val="04A0" w:firstRow="1" w:lastRow="0" w:firstColumn="1" w:lastColumn="0" w:noHBand="0" w:noVBand="1"/>
             </w:tblPr>
             <w:tblGrid>
-              <w:gridCol w:w="852"/>
-              <w:gridCol w:w="523"/>
-              <w:gridCol w:w="785"/>
+              <w:gridCol w:w="868"/>
+              <w:gridCol w:w="532"/>
+              <w:gridCol w:w="760"/>
             </w:tblGrid>
             <w:tr>
               <w:trPr>
@@ -239,7 +245,7 @@
               </w:tc>
               <w:tc>
                 <w:tcPr>
-                  <w:tcW w:w="756" w:type="dxa"/>
+                  <w:tcW w:w="720" w:type="dxa"/>
                   <w:shd w:val="clear" w:color="auto" w:fill="CCCCCC"/>
                   <w:tcMar>
                     <w:left w:w="29" w:type="dxa"/>

</xml_diff>

<commit_message>
WIP: restore local edits after revert; ready to review
</commit_message>
<xml_diff>
--- a/src/core/generation/templates/preroll.docx
+++ b/src/core/generation/templates/preroll.docx
@@ -7,12 +7,11 @@
         <w:tblStyle w:val="TableGrid"/>
         <w:tblpPr w:horzAnchor="margin" w:tblpXSpec="center" w:tblpY="303"/>
         <w:tblOverlap w:val="never"/>
-        <w:tblW w:w="2160" w:type="dxa"/>
         <w:tblBorders>
           <w:insideH w:val="none" w:sz="0" w:space="0" w:color="auto"/>
           <w:insideV w:val="none" w:sz="0" w:space="0" w:color="auto"/>
         </w:tblBorders>
-        <w:tblLayout w:type="fixed"/>
+        <w:tblLayout w:type="autofit"/>
         <w:tblCellMar>
           <w:left w:w="15" w:type="dxa"/>
           <w:right w:w="15" w:type="dxa"/>
@@ -20,7 +19,7 @@
         <w:tblLook w:val="0000" w:firstRow="0" w:lastRow="0" w:firstColumn="0" w:lastColumn="0" w:noHBand="0" w:noVBand="0"/>
       </w:tblPr>
       <w:tblGrid>
-        <w:gridCol w:w="2160"/>
+        <w:gridCol/>
       </w:tblGrid>
       <w:tr>
         <w:trPr>
@@ -29,7 +28,6 @@
         </w:trPr>
         <w:tc>
           <w:tcPr>
-            <w:tcW w:w="2160" w:type="dxa"/>
             <w:shd w:val="clear" w:color="auto" w:fill="13274B"/>
             <w:noWrap/>
             <w:vAlign w:val="center"/>
@@ -126,7 +124,8 @@
             </w:tblGrid>
             <w:tr>
               <w:trPr>
-                <w:trHeight w:val="223"/>
+                <w:cantSplit/>
+                <w:trHeight w:hRule="exact" w:val="288"/>
                 <w:jc w:val="center"/>
               </w:trPr>
               <w:tc>

</xml_diff>

<commit_message>
fix(preroll): prevent vendor name from showing as brand on preroll labels
- Skip vendor-as-brand fallback for preroll/infused preroll types in excel_processor.py
- Skip vendor fallback for preroll/mini templates in template_processor.py
- Preroll labels now show actual Product Brand or empty, not vendor name

Co-Authored-By: Claude Opus 4.5 <noreply@anthropic.com>
</commit_message>
<xml_diff>
--- a/src/core/generation/templates/preroll.docx
+++ b/src/core/generation/templates/preroll.docx
@@ -7,11 +7,12 @@
         <w:tblStyle w:val="TableGrid"/>
         <w:tblpPr w:horzAnchor="margin" w:tblpXSpec="center" w:tblpY="303"/>
         <w:tblOverlap w:val="never"/>
+        <w:tblW w:w="2160" w:type="dxa"/>
         <w:tblBorders>
           <w:insideH w:val="none" w:sz="0" w:space="0" w:color="auto"/>
           <w:insideV w:val="none" w:sz="0" w:space="0" w:color="auto"/>
         </w:tblBorders>
-        <w:tblLayout w:type="autofit"/>
+        <w:tblLayout w:type="fixed"/>
         <w:tblCellMar>
           <w:left w:w="15" w:type="dxa"/>
           <w:right w:w="15" w:type="dxa"/>
@@ -19,7 +20,7 @@
         <w:tblLook w:val="0000" w:firstRow="0" w:lastRow="0" w:firstColumn="0" w:lastColumn="0" w:noHBand="0" w:noVBand="0"/>
       </w:tblPr>
       <w:tblGrid>
-        <w:gridCol/>
+        <w:gridCol w:w="2160"/>
       </w:tblGrid>
       <w:tr>
         <w:trPr>
@@ -28,6 +29,7 @@
         </w:trPr>
         <w:tc>
           <w:tcPr>
+            <w:tcW w:w="2160" w:type="dxa"/>
             <w:shd w:val="clear" w:color="auto" w:fill="13274B"/>
             <w:noWrap/>
             <w:vAlign w:val="center"/>
@@ -124,8 +126,7 @@
             </w:tblGrid>
             <w:tr>
               <w:trPr>
-                <w:cantSplit/>
-                <w:trHeight w:hRule="exact" w:val="288"/>
+                <w:trHeight w:val="223"/>
                 <w:jc w:val="center"/>
               </w:trPr>
               <w:tc>

</xml_diff>

<commit_message>
Fix: remove in-function import re to avoid UnboundLocalError
</commit_message>
<xml_diff>
--- a/src/core/generation/templates/preroll.docx
+++ b/src/core/generation/templates/preroll.docx
@@ -50,7 +50,7 @@
             </w:tblGrid>
             <w:tr>
               <w:trPr>
-                <w:trHeight w:val="999"/>
+                <w:trHeight w:hRule="exact" w:val="994"/>
               </w:trPr>
               <w:tc>
                 <w:tcPr>
@@ -126,7 +126,7 @@
             </w:tblGrid>
             <w:tr>
               <w:trPr>
-                <w:trHeight w:val="223"/>
+                <w:trHeight w:hRule="exact" w:val="288"/>
                 <w:jc w:val="center"/>
               </w:trPr>
               <w:tc>

</xml_diff>